<commit_message>
update after feedback w/ career center 0916
</commit_message>
<xml_diff>
--- a/docs/Technical Resume.docx
+++ b/docs/Technical Resume.docx
@@ -7,14 +7,65 @@
         <w:widowControl w:val="0"/>
         <w:spacing w:after="8"/>
         <w:jc w:val="center"/>
-      </w:pPr>
-      <w:r>
-        <w:rPr>
+        <w:rPr>
+          <w:rFonts w:eastAsia="맑은 고딕"/>
           <w:b/>
           <w:sz w:val="36"/>
+          <w:lang w:eastAsia="ko-KR"/>
+        </w:rPr>
+      </w:pPr>
+      <w:r>
+        <w:rPr>
+          <w:b/>
+          <w:sz w:val="36"/>
         </w:rPr>
         <w:t>Gyuwon Na</w:t>
       </w:r>
+    </w:p>
+    <w:p>
+      <w:pPr>
+        <w:widowControl w:val="0"/>
+        <w:spacing w:after="8"/>
+        <w:jc w:val="center"/>
+        <w:rPr>
+          <w:rFonts w:eastAsia="맑은 고딕"/>
+          <w:bCs/>
+          <w:sz w:val="22"/>
+          <w:lang w:eastAsia="ko-KR"/>
+        </w:rPr>
+      </w:pPr>
+      <w:r>
+        <w:rPr>
+          <w:rFonts w:eastAsia="맑은 고딕" w:hint="eastAsia"/>
+          <w:bCs/>
+          <w:sz w:val="22"/>
+          <w:lang w:eastAsia="ko-KR"/>
+        </w:rPr>
+        <w:t>Software Engineer</w:t>
+      </w:r>
+      <w:r>
+        <w:rPr>
+          <w:rFonts w:eastAsia="맑은 고딕" w:hint="eastAsia"/>
+          <w:bCs/>
+          <w:sz w:val="22"/>
+          <w:lang w:eastAsia="ko-KR"/>
+        </w:rPr>
+        <w:t xml:space="preserve"> | Computer Vision Engineer | Autonomy Software Engineer</w:t>
+      </w:r>
+    </w:p>
+    <w:p>
+      <w:pPr>
+        <w:widowControl w:val="0"/>
+        <w:spacing w:after="8"/>
+        <w:jc w:val="center"/>
+        <w:rPr>
+          <w:rFonts w:eastAsia="맑은 고딕"/>
+          <w:bCs/>
+          <w:sz w:val="4"/>
+          <w:szCs w:val="4"/>
+          <w:lang w:eastAsia="ko-KR"/>
+        </w:rPr>
+      </w:pPr>
     </w:p>
     <w:p>
       <w:pPr>
@@ -126,42 +177,12 @@
       </w:r>
       <w:r>
         <w:rPr>
-          <w:b/>
-          <w:sz w:val="18"/>
-        </w:rPr>
-        <w:t xml:space="preserve">Aug 2026 </w:t>
-      </w:r>
-      <w:r>
-        <w:rPr>
-          <w:b/>
-          <w:sz w:val="18"/>
-        </w:rPr>
-        <w:t>–</w:t>
-      </w:r>
-      <w:r>
-        <w:rPr>
-          <w:b/>
-          <w:sz w:val="18"/>
-        </w:rPr>
-        <w:t xml:space="preserve"> </w:t>
-      </w:r>
-      <w:r>
-        <w:rPr>
-          <w:rFonts w:eastAsia="맑은 고딕"/>
-          <w:b/>
-          <w:sz w:val="18"/>
-          <w:lang w:eastAsia="ko-KR"/>
-        </w:rPr>
-        <w:t>Expected</w:t>
-      </w:r>
-      <w:r>
-        <w:rPr>
           <w:rFonts w:eastAsia="맑은 고딕" w:hint="eastAsia"/>
           <w:b/>
           <w:sz w:val="18"/>
           <w:lang w:eastAsia="ko-KR"/>
         </w:rPr>
-        <w:t xml:space="preserve"> May 2028</w:t>
+        <w:t>May 2028</w:t>
       </w:r>
     </w:p>
     <w:p>
@@ -265,73 +286,6 @@
       </w:r>
       <w:r>
         <w:t xml:space="preserve"> | GPA: 4.38 / 4.5</w:t>
-      </w:r>
-    </w:p>
-    <w:p>
-      <w:pPr>
-        <w:widowControl w:val="0"/>
-        <w:spacing w:after="8"/>
-        <w:rPr>
-          <w:rFonts w:eastAsia="맑은 고딕"/>
-          <w:lang w:eastAsia="ko-KR"/>
-        </w:rPr>
-      </w:pPr>
-      <w:r>
-        <w:rPr>
-          <w:b/>
-        </w:rPr>
-        <w:t xml:space="preserve">Coursework: </w:t>
-      </w:r>
-      <w:r>
-        <w:t>Computer Graphics,</w:t>
-      </w:r>
-      <w:r>
-        <w:rPr>
-          <w:rFonts w:eastAsia="맑은 고딕" w:hint="eastAsia"/>
-          <w:lang w:eastAsia="ko-KR"/>
-        </w:rPr>
-        <w:t xml:space="preserve"> </w:t>
-      </w:r>
-      <w:r>
-        <w:t xml:space="preserve">Data Structures, </w:t>
-      </w:r>
-      <w:r>
-        <w:rPr>
-          <w:rFonts w:eastAsia="맑은 고딕" w:hint="eastAsia"/>
-          <w:lang w:eastAsia="ko-KR"/>
-        </w:rPr>
-        <w:t>Computer Network</w:t>
-      </w:r>
-      <w:r>
-        <w:rPr>
-          <w:rFonts w:eastAsia="맑은 고딕" w:hint="eastAsia"/>
-          <w:lang w:eastAsia="ko-KR"/>
-        </w:rPr>
-        <w:t>s</w:t>
-      </w:r>
-      <w:r>
-        <w:rPr>
-          <w:rFonts w:eastAsia="맑은 고딕" w:hint="eastAsia"/>
-          <w:lang w:eastAsia="ko-KR"/>
-        </w:rPr>
-        <w:t xml:space="preserve">, </w:t>
-      </w:r>
-      <w:r>
-        <w:t>Digital Signal Processing</w:t>
-      </w:r>
-      <w:r>
-        <w:rPr>
-          <w:rFonts w:eastAsia="맑은 고딕" w:hint="eastAsia"/>
-          <w:lang w:eastAsia="ko-KR"/>
-        </w:rPr>
-        <w:t xml:space="preserve">, </w:t>
-      </w:r>
-      <w:r>
-        <w:rPr>
-          <w:rFonts w:eastAsia="맑은 고딕"/>
-          <w:lang w:eastAsia="ko-KR"/>
-        </w:rPr>
-        <w:t>Circuit Analysis</w:t>
       </w:r>
     </w:p>
     <w:p>
@@ -472,8 +426,8 @@
         <w:spacing w:after="8"/>
         <w:rPr>
           <w:rFonts w:eastAsia="맑은 고딕"/>
-          <w:sz w:val="12"/>
-          <w:szCs w:val="14"/>
+          <w:sz w:val="10"/>
+          <w:szCs w:val="12"/>
           <w:lang w:eastAsia="ko-KR"/>
         </w:rPr>
       </w:pPr>
@@ -818,8 +772,8 @@
         <w:spacing w:after="0"/>
         <w:rPr>
           <w:rFonts w:eastAsia="맑은 고딕"/>
-          <w:sz w:val="12"/>
-          <w:szCs w:val="14"/>
+          <w:sz w:val="10"/>
+          <w:szCs w:val="12"/>
           <w:lang w:eastAsia="ko-KR"/>
         </w:rPr>
       </w:pPr>
@@ -1086,14 +1040,7 @@
           <w:sz w:val="18"/>
           <w:lang w:eastAsia="ko-KR"/>
         </w:rPr>
-        <w:t xml:space="preserve">Personal </w:t>
-      </w:r>
-      <w:r>
-        <w:rPr>
-          <w:b/>
-          <w:sz w:val="18"/>
-        </w:rPr>
-        <w:t>Project</w:t>
+        <w:t>Computer Vision Engineer</w:t>
       </w:r>
       <w:r>
         <w:rPr>
@@ -1212,14 +1159,21 @@
           <w:b/>
           <w:szCs w:val="19"/>
         </w:rPr>
-        <w:t>RANSAC-based geometric verificatio</w:t>
+        <w:t>RANSAC-based geometric verifica</w:t>
+      </w:r>
+      <w:r>
+        <w:rPr>
+          <w:b/>
+          <w:szCs w:val="19"/>
+        </w:rPr>
+        <w:t>tion</w:t>
       </w:r>
       <w:r>
         <w:rPr>
           <w:bCs/>
           <w:szCs w:val="19"/>
         </w:rPr>
-        <w:t>n to reject ambiguous feature matches.</w:t>
+        <w:t xml:space="preserve"> to reject ambiguous feature matches.</w:t>
       </w:r>
     </w:p>
     <w:p>

</xml_diff>